<commit_message>
Plano de ação atualizado
</commit_message>
<xml_diff>
--- a/docs/DRP01 - Plano de Ação - Sistema com Acessibilidade de Cadastro de Clientes.docx
+++ b/docs/DRP01 - Plano de Ação - Sistema com Acessibilidade de Cadastro de Clientes.docx
@@ -1457,12 +1457,8 @@
             </w:pPr>
             <w:r>
               <w:rPr>
-                <w:rFonts w:eastAsia="Calibri" w:cs="Calibri" w:ascii="Trebuchet MS" w:hAnsi="Trebuchet MS"/>
+                <w:rFonts w:ascii="Trebuchet MS" w:hAnsi="Trebuchet MS"/>
                 <w:color w:themeColor="text1" w:val="000000"/>
-                <w:kern w:val="0"/>
-                <w:sz w:val="22"/>
-                <w:szCs w:val="22"/>
-                <w:lang w:val="pt-BR" w:eastAsia="pt-BR" w:bidi="ar-SA"/>
               </w:rPr>
             </w:r>
           </w:p>
@@ -1686,8 +1682,8 @@
       </w:tblPr>
       <w:tblGrid>
         <w:gridCol w:w="2033"/>
-        <w:gridCol w:w="1722"/>
-        <w:gridCol w:w="1414"/>
+        <w:gridCol w:w="1721"/>
+        <w:gridCol w:w="1415"/>
         <w:gridCol w:w="1380"/>
         <w:gridCol w:w="2447"/>
       </w:tblGrid>
@@ -1839,7 +1835,7 @@
         </w:tc>
         <w:tc>
           <w:tcPr>
-            <w:tcW w:w="1722" w:type="dxa"/>
+            <w:tcW w:w="1721" w:type="dxa"/>
             <w:tcBorders>
               <w:top w:val="single" w:sz="2" w:space="0" w:color="000000"/>
             </w:tcBorders>
@@ -1879,7 +1875,7 @@
         </w:tc>
         <w:tc>
           <w:tcPr>
-            <w:tcW w:w="1414" w:type="dxa"/>
+            <w:tcW w:w="1415" w:type="dxa"/>
             <w:tcBorders>
               <w:top w:val="single" w:sz="2" w:space="0" w:color="000000"/>
             </w:tcBorders>
@@ -2043,7 +2039,7 @@
         </w:tc>
         <w:tc>
           <w:tcPr>
-            <w:tcW w:w="1722" w:type="dxa"/>
+            <w:tcW w:w="1721" w:type="dxa"/>
             <w:tcBorders/>
             <w:tcMar>
               <w:top w:w="57" w:type="dxa"/>
@@ -2079,7 +2075,7 @@
         </w:tc>
         <w:tc>
           <w:tcPr>
-            <w:tcW w:w="1414" w:type="dxa"/>
+            <w:tcW w:w="1415" w:type="dxa"/>
             <w:tcBorders/>
             <w:tcMar>
               <w:top w:w="57" w:type="dxa"/>
@@ -2226,23 +2222,13 @@
                 <w:szCs w:val="22"/>
                 <w:lang w:val="pt-BR" w:eastAsia="pt-BR" w:bidi="ar-SA"/>
               </w:rPr>
-              <w:t xml:space="preserve">Levantar requisitos </w:t>
-            </w:r>
-            <w:r>
-              <w:rPr>
-                <w:rFonts w:eastAsia="Calibri" w:cs="Calibri"/>
-                <w:kern w:val="0"/>
-                <w:sz w:val="22"/>
-                <w:szCs w:val="22"/>
-                <w:lang w:val="pt-BR" w:eastAsia="pt-BR" w:bidi="ar-SA"/>
-              </w:rPr>
-              <w:t>e ferramentas de acessibilidade, cloud e testes</w:t>
-            </w:r>
-          </w:p>
-        </w:tc>
-        <w:tc>
-          <w:tcPr>
-            <w:tcW w:w="1722" w:type="dxa"/>
+              <w:t>Levantar requisitos e ferramentas de acessibilidade, cloud e testes</w:t>
+            </w:r>
+          </w:p>
+        </w:tc>
+        <w:tc>
+          <w:tcPr>
+            <w:tcW w:w="1721" w:type="dxa"/>
             <w:tcBorders/>
             <w:tcMar>
               <w:top w:w="57" w:type="dxa"/>
@@ -2278,7 +2264,7 @@
         </w:tc>
         <w:tc>
           <w:tcPr>
-            <w:tcW w:w="1414" w:type="dxa"/>
+            <w:tcW w:w="1415" w:type="dxa"/>
             <w:tcBorders/>
             <w:tcMar>
               <w:top w:w="57" w:type="dxa"/>
@@ -2423,33 +2409,13 @@
                 <w:szCs w:val="22"/>
                 <w:lang w:val="pt-BR" w:eastAsia="pt-BR" w:bidi="ar-SA"/>
               </w:rPr>
-              <w:t xml:space="preserve">Pesquisar </w:t>
-            </w:r>
-            <w:r>
-              <w:rPr>
-                <w:rFonts w:eastAsia="Calibri" w:cs="Calibri"/>
-                <w:kern w:val="0"/>
-                <w:sz w:val="22"/>
-                <w:szCs w:val="22"/>
-                <w:lang w:val="pt-BR" w:eastAsia="pt-BR" w:bidi="ar-SA"/>
-              </w:rPr>
-              <w:t>tecnologias de teste</w:t>
-            </w:r>
-            <w:r>
-              <w:rPr>
-                <w:rFonts w:eastAsia="Calibri" w:cs="Calibri"/>
-                <w:kern w:val="0"/>
-                <w:sz w:val="22"/>
-                <w:szCs w:val="22"/>
-                <w:lang w:val="pt-BR" w:eastAsia="pt-BR" w:bidi="ar-SA"/>
-              </w:rPr>
-              <w:t xml:space="preserve"> e ferramentas de acessibilidade</w:t>
-            </w:r>
-          </w:p>
-        </w:tc>
-        <w:tc>
-          <w:tcPr>
-            <w:tcW w:w="1722" w:type="dxa"/>
+              <w:t>Pesquisar tecnologias de teste e ferramentas de acessibilidade</w:t>
+            </w:r>
+          </w:p>
+        </w:tc>
+        <w:tc>
+          <w:tcPr>
+            <w:tcW w:w="1721" w:type="dxa"/>
             <w:tcBorders/>
             <w:tcMar>
               <w:top w:w="57" w:type="dxa"/>
@@ -2485,7 +2451,7 @@
         </w:tc>
         <w:tc>
           <w:tcPr>
-            <w:tcW w:w="1414" w:type="dxa"/>
+            <w:tcW w:w="1415" w:type="dxa"/>
             <w:tcBorders/>
             <w:tcMar>
               <w:top w:w="57" w:type="dxa"/>
@@ -2587,47 +2553,7 @@
                 <w:szCs w:val="22"/>
                 <w:lang w:val="pt-BR" w:eastAsia="pt-BR" w:bidi="ar-SA"/>
               </w:rPr>
-              <w:t xml:space="preserve">(Exemplo: </w:t>
-            </w:r>
-            <w:r>
-              <w:rPr>
-                <w:rFonts w:eastAsia="Calibri" w:cs="Calibri"/>
-                <w:kern w:val="0"/>
-                <w:sz w:val="22"/>
-                <w:szCs w:val="22"/>
-                <w:lang w:val="pt-BR" w:eastAsia="pt-BR" w:bidi="ar-SA"/>
-              </w:rPr>
-              <w:t>Selenium</w:t>
-            </w:r>
-            <w:r>
-              <w:rPr>
-                <w:rFonts w:eastAsia="Calibri" w:cs="Calibri"/>
-                <w:kern w:val="0"/>
-                <w:sz w:val="22"/>
-                <w:szCs w:val="22"/>
-                <w:lang w:val="pt-BR" w:eastAsia="pt-BR" w:bidi="ar-SA"/>
-              </w:rPr>
-              <w:t xml:space="preserve">, </w:t>
-            </w:r>
-            <w:r>
-              <w:rPr>
-                <w:rFonts w:eastAsia="Calibri" w:cs="Calibri"/>
-                <w:kern w:val="0"/>
-                <w:sz w:val="22"/>
-                <w:szCs w:val="22"/>
-                <w:lang w:val="pt-BR" w:eastAsia="pt-BR" w:bidi="ar-SA"/>
-              </w:rPr>
-              <w:t>LightHouse, etc.</w:t>
-            </w:r>
-            <w:r>
-              <w:rPr>
-                <w:rFonts w:eastAsia="Calibri" w:cs="Calibri"/>
-                <w:kern w:val="0"/>
-                <w:sz w:val="22"/>
-                <w:szCs w:val="22"/>
-                <w:lang w:val="pt-BR" w:eastAsia="pt-BR" w:bidi="ar-SA"/>
-              </w:rPr>
-              <w:t>)</w:t>
+              <w:t>(Exemplo: Selenium, LightHouse, etc.)</w:t>
             </w:r>
           </w:p>
         </w:tc>
@@ -2676,7 +2602,7 @@
         </w:tc>
         <w:tc>
           <w:tcPr>
-            <w:tcW w:w="1722" w:type="dxa"/>
+            <w:tcW w:w="1721" w:type="dxa"/>
             <w:tcBorders/>
             <w:tcMar>
               <w:top w:w="57" w:type="dxa"/>
@@ -2711,7 +2637,7 @@
         </w:tc>
         <w:tc>
           <w:tcPr>
-            <w:tcW w:w="1414" w:type="dxa"/>
+            <w:tcW w:w="1415" w:type="dxa"/>
             <w:tcBorders/>
             <w:tcMar>
               <w:top w:w="57" w:type="dxa"/>
@@ -3379,17 +3305,7 @@
                 <w:szCs w:val="22"/>
                 <w:lang w:val="pt-BR" w:eastAsia="pt-BR" w:bidi="ar-SA"/>
               </w:rPr>
-              <w:t xml:space="preserve">Identificar </w:t>
-            </w:r>
-            <w:r>
-              <w:rPr>
-                <w:rFonts w:eastAsia="Calibri" w:cs="Calibri"/>
-                <w:kern w:val="0"/>
-                <w:sz w:val="22"/>
-                <w:szCs w:val="22"/>
-                <w:lang w:val="pt-BR" w:eastAsia="pt-BR" w:bidi="ar-SA"/>
-              </w:rPr>
-              <w:t>erros de acessibilidade e disponibilidade</w:t>
+              <w:t>Identificar erros de acessibilidade e disponibilidade</w:t>
             </w:r>
           </w:p>
         </w:tc>
@@ -3425,6 +3341,33 @@
                 <w:szCs w:val="22"/>
                 <w:lang w:val="pt-BR" w:eastAsia="pt-BR" w:bidi="ar-SA"/>
               </w:rPr>
+              <w:t>André Schiavone</w:t>
+            </w:r>
+          </w:p>
+          <w:p>
+            <w:pPr>
+              <w:pStyle w:val="Normal"/>
+              <w:widowControl/>
+              <w:suppressAutoHyphens w:val="true"/>
+              <w:spacing w:before="0" w:after="0"/>
+              <w:jc w:val="center"/>
+              <w:rPr>
+                <w:rFonts w:eastAsia="Calibri" w:cs="Calibri"/>
+                <w:kern w:val="0"/>
+                <w:sz w:val="22"/>
+                <w:szCs w:val="22"/>
+                <w:lang w:val="pt-BR" w:eastAsia="pt-BR" w:bidi="ar-SA"/>
+              </w:rPr>
+            </w:pPr>
+            <w:r>
+              <w:rPr>
+                <w:rFonts w:eastAsia="Calibri" w:cs="Calibri"/>
+                <w:kern w:val="0"/>
+                <w:sz w:val="22"/>
+                <w:szCs w:val="22"/>
+                <w:lang w:val="pt-BR" w:eastAsia="pt-BR" w:bidi="ar-SA"/>
+              </w:rPr>
+              <w:t>Nanete</w:t>
             </w:r>
           </w:p>
         </w:tc>
@@ -3575,53 +3518,33 @@
                 <w:szCs w:val="22"/>
                 <w:lang w:val="pt-BR" w:eastAsia="pt-BR" w:bidi="ar-SA"/>
               </w:rPr>
-              <w:t xml:space="preserve">Definir </w:t>
-            </w:r>
-            <w:r>
-              <w:rPr>
-                <w:rFonts w:eastAsia="Calibri" w:cs="Calibri"/>
-                <w:kern w:val="0"/>
-                <w:sz w:val="22"/>
-                <w:szCs w:val="22"/>
-                <w:lang w:val="pt-BR" w:eastAsia="pt-BR" w:bidi="ar-SA"/>
-              </w:rPr>
-              <w:t>soluções</w:t>
-            </w:r>
-          </w:p>
-          <w:p>
-            <w:pPr>
-              <w:pStyle w:val="Normal"/>
-              <w:widowControl/>
-              <w:suppressAutoHyphens w:val="true"/>
-              <w:spacing w:before="0" w:after="0"/>
-              <w:jc w:val="center"/>
-              <w:rPr>
-                <w:rFonts w:eastAsia="Calibri" w:cs="Calibri"/>
-                <w:kern w:val="0"/>
-                <w:sz w:val="22"/>
-                <w:szCs w:val="22"/>
-                <w:lang w:val="pt-BR" w:eastAsia="pt-BR" w:bidi="ar-SA"/>
-              </w:rPr>
-            </w:pPr>
-            <w:r>
-              <w:rPr>
-                <w:rFonts w:eastAsia="Calibri" w:cs="Calibri"/>
-                <w:kern w:val="0"/>
-                <w:sz w:val="22"/>
-                <w:szCs w:val="22"/>
-                <w:lang w:val="pt-BR" w:eastAsia="pt-BR" w:bidi="ar-SA"/>
-              </w:rPr>
-              <w:t>para as limitações</w:t>
-            </w:r>
-            <w:r>
-              <w:rPr>
-                <w:rFonts w:eastAsia="Calibri" w:cs="Calibri"/>
-                <w:kern w:val="0"/>
-                <w:sz w:val="22"/>
-                <w:szCs w:val="22"/>
-                <w:lang w:val="pt-BR" w:eastAsia="pt-BR" w:bidi="ar-SA"/>
-              </w:rPr>
-              <w:t xml:space="preserve"> principais do sistema</w:t>
+              <w:t>Definir soluções</w:t>
+            </w:r>
+          </w:p>
+          <w:p>
+            <w:pPr>
+              <w:pStyle w:val="Normal"/>
+              <w:widowControl/>
+              <w:suppressAutoHyphens w:val="true"/>
+              <w:spacing w:before="0" w:after="0"/>
+              <w:jc w:val="center"/>
+              <w:rPr>
+                <w:rFonts w:eastAsia="Calibri" w:cs="Calibri"/>
+                <w:kern w:val="0"/>
+                <w:sz w:val="22"/>
+                <w:szCs w:val="22"/>
+                <w:lang w:val="pt-BR" w:eastAsia="pt-BR" w:bidi="ar-SA"/>
+              </w:rPr>
+            </w:pPr>
+            <w:r>
+              <w:rPr>
+                <w:rFonts w:eastAsia="Calibri" w:cs="Calibri"/>
+                <w:kern w:val="0"/>
+                <w:sz w:val="22"/>
+                <w:szCs w:val="22"/>
+                <w:lang w:val="pt-BR" w:eastAsia="pt-BR" w:bidi="ar-SA"/>
+              </w:rPr>
+              <w:t>para as limitações principais do sistema</w:t>
             </w:r>
           </w:p>
         </w:tc>
@@ -3657,6 +3580,7 @@
                 <w:szCs w:val="22"/>
                 <w:lang w:val="pt-BR" w:eastAsia="pt-BR" w:bidi="ar-SA"/>
               </w:rPr>
+              <w:t>Emily Thomaz Lima</w:t>
             </w:r>
           </w:p>
         </w:tc>
@@ -3843,6 +3767,7 @@
                 <w:szCs w:val="22"/>
                 <w:lang w:val="pt-BR" w:eastAsia="pt-BR" w:bidi="ar-SA"/>
               </w:rPr>
+              <w:t>Emily Thomaz Lima</w:t>
             </w:r>
           </w:p>
         </w:tc>
@@ -3994,17 +3919,7 @@
                 <w:szCs w:val="22"/>
                 <w:lang w:val="pt-BR" w:eastAsia="pt-BR" w:bidi="ar-SA"/>
               </w:rPr>
-              <w:t>Criar o esboço da estrutura d</w:t>
-            </w:r>
-            <w:r>
-              <w:rPr>
-                <w:rFonts w:eastAsia="Calibri" w:cs="Calibri"/>
-                <w:kern w:val="0"/>
-                <w:sz w:val="22"/>
-                <w:szCs w:val="22"/>
-                <w:lang w:val="pt-BR" w:eastAsia="pt-BR" w:bidi="ar-SA"/>
-              </w:rPr>
-              <w:t>e hospedagem</w:t>
+              <w:t>Criar o esboço da estrutura de hospedagem</w:t>
             </w:r>
           </w:p>
         </w:tc>
@@ -4042,6 +3957,7 @@
                 <w:szCs w:val="22"/>
                 <w:lang w:val="pt-BR" w:eastAsia="pt-BR" w:bidi="ar-SA"/>
               </w:rPr>
+              <w:t>Emily Thomaz Lima</w:t>
             </w:r>
           </w:p>
         </w:tc>
@@ -5091,37 +5007,7 @@
                 <w:szCs w:val="22"/>
                 <w:lang w:val="pt-BR" w:eastAsia="pt-BR" w:bidi="ar-SA"/>
               </w:rPr>
-              <w:t xml:space="preserve">Iniciar </w:t>
-            </w:r>
-            <w:r>
-              <w:rPr>
-                <w:rFonts w:eastAsia="Calibri" w:cs="Calibri"/>
-                <w:kern w:val="0"/>
-                <w:sz w:val="22"/>
-                <w:szCs w:val="22"/>
-                <w:lang w:val="pt-BR" w:eastAsia="pt-BR" w:bidi="ar-SA"/>
-              </w:rPr>
-              <w:t>soluções</w:t>
-            </w:r>
-            <w:r>
-              <w:rPr>
-                <w:rFonts w:eastAsia="Calibri" w:cs="Calibri"/>
-                <w:kern w:val="0"/>
-                <w:sz w:val="22"/>
-                <w:szCs w:val="22"/>
-                <w:lang w:val="pt-BR" w:eastAsia="pt-BR" w:bidi="ar-SA"/>
-              </w:rPr>
-              <w:t xml:space="preserve"> d</w:t>
-            </w:r>
-            <w:r>
-              <w:rPr>
-                <w:rFonts w:eastAsia="Calibri" w:cs="Calibri"/>
-                <w:kern w:val="0"/>
-                <w:sz w:val="22"/>
-                <w:szCs w:val="22"/>
-                <w:lang w:val="pt-BR" w:eastAsia="pt-BR" w:bidi="ar-SA"/>
-              </w:rPr>
-              <w:t>e acessibilidade e nuvem, performar testes iniciais</w:t>
+              <w:t>Iniciar soluções de acessibilidade e nuvem, performar testes iniciais</w:t>
             </w:r>
           </w:p>
         </w:tc>
@@ -5157,6 +5043,33 @@
                 <w:szCs w:val="22"/>
                 <w:lang w:val="pt-BR" w:eastAsia="pt-BR" w:bidi="ar-SA"/>
               </w:rPr>
+              <w:t>André Schiavone</w:t>
+            </w:r>
+          </w:p>
+          <w:p>
+            <w:pPr>
+              <w:pStyle w:val="Normal"/>
+              <w:widowControl/>
+              <w:suppressAutoHyphens w:val="true"/>
+              <w:spacing w:before="0" w:after="0"/>
+              <w:jc w:val="center"/>
+              <w:rPr>
+                <w:rFonts w:eastAsia="Calibri" w:cs="Calibri"/>
+                <w:kern w:val="0"/>
+                <w:sz w:val="22"/>
+                <w:szCs w:val="22"/>
+                <w:lang w:val="pt-BR" w:eastAsia="pt-BR" w:bidi="ar-SA"/>
+              </w:rPr>
+            </w:pPr>
+            <w:r>
+              <w:rPr>
+                <w:rFonts w:eastAsia="Calibri" w:cs="Calibri"/>
+                <w:kern w:val="0"/>
+                <w:sz w:val="22"/>
+                <w:szCs w:val="22"/>
+                <w:lang w:val="pt-BR" w:eastAsia="pt-BR" w:bidi="ar-SA"/>
+              </w:rPr>
+              <w:t>Nanete</w:t>
             </w:r>
           </w:p>
         </w:tc>
@@ -5832,17 +5745,7 @@
                 <w:szCs w:val="22"/>
                 <w:lang w:val="pt-BR" w:eastAsia="pt-BR" w:bidi="ar-SA"/>
               </w:rPr>
-              <w:t>Ajustar HTML e</w:t>
-            </w:r>
-            <w:r>
-              <w:rPr>
-                <w:rFonts w:eastAsia="Calibri" w:cs="Calibri"/>
-                <w:kern w:val="0"/>
-                <w:sz w:val="22"/>
-                <w:szCs w:val="22"/>
-                <w:lang w:val="pt-BR" w:eastAsia="pt-BR" w:bidi="ar-SA"/>
-              </w:rPr>
-              <w:t xml:space="preserve"> estilos (CSS)</w:t>
+              <w:t>Ajustar HTML e estilos (CSS)</w:t>
             </w:r>
           </w:p>
         </w:tc>
@@ -5878,6 +5781,33 @@
                 <w:szCs w:val="22"/>
                 <w:lang w:val="pt-BR" w:eastAsia="pt-BR" w:bidi="ar-SA"/>
               </w:rPr>
+              <w:t>André Schiavone</w:t>
+            </w:r>
+          </w:p>
+          <w:p>
+            <w:pPr>
+              <w:pStyle w:val="Normal"/>
+              <w:widowControl/>
+              <w:suppressAutoHyphens w:val="true"/>
+              <w:spacing w:before="0" w:after="0"/>
+              <w:jc w:val="center"/>
+              <w:rPr>
+                <w:rFonts w:eastAsia="Calibri" w:cs="Calibri"/>
+                <w:kern w:val="0"/>
+                <w:sz w:val="22"/>
+                <w:szCs w:val="22"/>
+                <w:lang w:val="pt-BR" w:eastAsia="pt-BR" w:bidi="ar-SA"/>
+              </w:rPr>
+            </w:pPr>
+            <w:r>
+              <w:rPr>
+                <w:rFonts w:eastAsia="Calibri" w:cs="Calibri"/>
+                <w:kern w:val="0"/>
+                <w:sz w:val="22"/>
+                <w:szCs w:val="22"/>
+                <w:lang w:val="pt-BR" w:eastAsia="pt-BR" w:bidi="ar-SA"/>
+              </w:rPr>
+              <w:t>Nanete</w:t>
             </w:r>
           </w:p>
         </w:tc>
@@ -6054,27 +5984,7 @@
                 <w:szCs w:val="22"/>
                 <w:lang w:val="pt-BR" w:eastAsia="pt-BR" w:bidi="ar-SA"/>
               </w:rPr>
-              <w:t xml:space="preserve">Testar </w:t>
-            </w:r>
-            <w:r>
-              <w:rPr>
-                <w:rFonts w:eastAsia="Calibri" w:cs="Calibri"/>
-                <w:kern w:val="0"/>
-                <w:sz w:val="22"/>
-                <w:szCs w:val="22"/>
-                <w:lang w:val="pt-BR" w:eastAsia="pt-BR" w:bidi="ar-SA"/>
-              </w:rPr>
-              <w:t xml:space="preserve">acessibilidade na </w:t>
-            </w:r>
-            <w:r>
-              <w:rPr>
-                <w:rFonts w:eastAsia="Calibri" w:cs="Calibri"/>
-                <w:kern w:val="0"/>
-                <w:sz w:val="22"/>
-                <w:szCs w:val="22"/>
-                <w:lang w:val="pt-BR" w:eastAsia="pt-BR" w:bidi="ar-SA"/>
-              </w:rPr>
-              <w:t>inserção e consulta de dados no banco</w:t>
+              <w:t>Testar acessibilidade na inserção e consulta de dados no banco</w:t>
             </w:r>
           </w:p>
         </w:tc>
@@ -6110,6 +6020,33 @@
                 <w:szCs w:val="22"/>
                 <w:lang w:val="pt-BR" w:eastAsia="pt-BR" w:bidi="ar-SA"/>
               </w:rPr>
+              <w:t>André Schiavone</w:t>
+            </w:r>
+          </w:p>
+          <w:p>
+            <w:pPr>
+              <w:pStyle w:val="Normal"/>
+              <w:widowControl/>
+              <w:suppressAutoHyphens w:val="true"/>
+              <w:spacing w:before="0" w:after="0"/>
+              <w:jc w:val="center"/>
+              <w:rPr>
+                <w:rFonts w:eastAsia="Calibri" w:cs="Calibri"/>
+                <w:kern w:val="0"/>
+                <w:sz w:val="22"/>
+                <w:szCs w:val="22"/>
+                <w:lang w:val="pt-BR" w:eastAsia="pt-BR" w:bidi="ar-SA"/>
+              </w:rPr>
+            </w:pPr>
+            <w:r>
+              <w:rPr>
+                <w:rFonts w:eastAsia="Calibri" w:cs="Calibri"/>
+                <w:kern w:val="0"/>
+                <w:sz w:val="22"/>
+                <w:szCs w:val="22"/>
+                <w:lang w:val="pt-BR" w:eastAsia="pt-BR" w:bidi="ar-SA"/>
+              </w:rPr>
+              <w:t>Nanete</w:t>
             </w:r>
           </w:p>
         </w:tc>
@@ -7385,6 +7322,33 @@
                 <w:szCs w:val="22"/>
                 <w:lang w:val="pt-BR" w:eastAsia="pt-BR" w:bidi="ar-SA"/>
               </w:rPr>
+              <w:t>André Schiavone</w:t>
+            </w:r>
+          </w:p>
+          <w:p>
+            <w:pPr>
+              <w:pStyle w:val="Normal"/>
+              <w:widowControl/>
+              <w:suppressAutoHyphens w:val="true"/>
+              <w:spacing w:before="0" w:after="0"/>
+              <w:jc w:val="center"/>
+              <w:rPr>
+                <w:rFonts w:eastAsia="Calibri" w:cs="Calibri"/>
+                <w:kern w:val="0"/>
+                <w:sz w:val="22"/>
+                <w:szCs w:val="22"/>
+                <w:lang w:val="pt-BR" w:eastAsia="pt-BR" w:bidi="ar-SA"/>
+              </w:rPr>
+            </w:pPr>
+            <w:r>
+              <w:rPr>
+                <w:rFonts w:eastAsia="Calibri" w:cs="Calibri"/>
+                <w:kern w:val="0"/>
+                <w:sz w:val="22"/>
+                <w:szCs w:val="22"/>
+                <w:lang w:val="pt-BR" w:eastAsia="pt-BR" w:bidi="ar-SA"/>
+              </w:rPr>
+              <w:t>Nanete</w:t>
             </w:r>
           </w:p>
         </w:tc>
@@ -7709,8 +7673,8 @@
       <w:tblGrid>
         <w:gridCol w:w="2266"/>
         <w:gridCol w:w="1690"/>
-        <w:gridCol w:w="1403"/>
-        <w:gridCol w:w="1379"/>
+        <w:gridCol w:w="1402"/>
+        <w:gridCol w:w="1380"/>
         <w:gridCol w:w="2258"/>
       </w:tblGrid>
       <w:tr>
@@ -7901,7 +7865,7 @@
         </w:tc>
         <w:tc>
           <w:tcPr>
-            <w:tcW w:w="1403" w:type="dxa"/>
+            <w:tcW w:w="1402" w:type="dxa"/>
             <w:tcBorders>
               <w:top w:val="single" w:sz="2" w:space="0" w:color="000000"/>
             </w:tcBorders>
@@ -7941,7 +7905,7 @@
         </w:tc>
         <w:tc>
           <w:tcPr>
-            <w:tcW w:w="1379" w:type="dxa"/>
+            <w:tcW w:w="1380" w:type="dxa"/>
             <w:tcBorders>
               <w:top w:val="single" w:sz="2" w:space="0" w:color="000000"/>
             </w:tcBorders>
@@ -8059,17 +8023,7 @@
                 <w:szCs w:val="22"/>
                 <w:lang w:val="pt-BR" w:eastAsia="pt-BR" w:bidi="ar-SA"/>
               </w:rPr>
-              <w:t xml:space="preserve">Testar todas as funcionalidades do sistema </w:t>
-            </w:r>
-            <w:r>
-              <w:rPr>
-                <w:rFonts w:eastAsia="Calibri" w:cs="Calibri"/>
-                <w:kern w:val="0"/>
-                <w:sz w:val="22"/>
-                <w:szCs w:val="22"/>
-                <w:lang w:val="pt-BR" w:eastAsia="pt-BR" w:bidi="ar-SA"/>
-              </w:rPr>
-              <w:t>e incluir ferramentas de teste</w:t>
+              <w:t>Testar todas as funcionalidades do sistema e incluir ferramentas de teste</w:t>
             </w:r>
           </w:p>
         </w:tc>
@@ -8105,12 +8059,13 @@
                 <w:szCs w:val="22"/>
                 <w:lang w:val="pt-BR" w:eastAsia="pt-BR" w:bidi="ar-SA"/>
               </w:rPr>
-            </w:r>
-          </w:p>
-        </w:tc>
-        <w:tc>
-          <w:tcPr>
-            <w:tcW w:w="1403" w:type="dxa"/>
+              <w:t>Emily Thomaz Lima</w:t>
+            </w:r>
+          </w:p>
+        </w:tc>
+        <w:tc>
+          <w:tcPr>
+            <w:tcW w:w="1402" w:type="dxa"/>
             <w:tcBorders/>
             <w:tcMar>
               <w:top w:w="57" w:type="dxa"/>
@@ -8145,7 +8100,7 @@
         </w:tc>
         <w:tc>
           <w:tcPr>
-            <w:tcW w:w="1379" w:type="dxa"/>
+            <w:tcW w:w="1380" w:type="dxa"/>
             <w:tcBorders/>
             <w:tcMar>
               <w:top w:w="57" w:type="dxa"/>
@@ -8295,7 +8250,7 @@
         </w:tc>
         <w:tc>
           <w:tcPr>
-            <w:tcW w:w="1403" w:type="dxa"/>
+            <w:tcW w:w="1402" w:type="dxa"/>
             <w:tcBorders/>
             <w:tcMar>
               <w:top w:w="57" w:type="dxa"/>
@@ -8330,7 +8285,7 @@
         </w:tc>
         <w:tc>
           <w:tcPr>
-            <w:tcW w:w="1379" w:type="dxa"/>
+            <w:tcW w:w="1380" w:type="dxa"/>
             <w:tcBorders/>
             <w:tcMar>
               <w:top w:w="57" w:type="dxa"/>
@@ -8481,7 +8436,7 @@
         </w:tc>
         <w:tc>
           <w:tcPr>
-            <w:tcW w:w="1403" w:type="dxa"/>
+            <w:tcW w:w="1402" w:type="dxa"/>
             <w:tcBorders/>
             <w:tcMar>
               <w:top w:w="57" w:type="dxa"/>
@@ -8516,7 +8471,7 @@
         </w:tc>
         <w:tc>
           <w:tcPr>
-            <w:tcW w:w="1379" w:type="dxa"/>
+            <w:tcW w:w="1380" w:type="dxa"/>
             <w:tcBorders/>
             <w:tcMar>
               <w:top w:w="57" w:type="dxa"/>
@@ -8666,7 +8621,7 @@
         </w:tc>
         <w:tc>
           <w:tcPr>
-            <w:tcW w:w="1403" w:type="dxa"/>
+            <w:tcW w:w="1402" w:type="dxa"/>
             <w:tcBorders/>
             <w:tcMar>
               <w:top w:w="57" w:type="dxa"/>
@@ -8701,7 +8656,7 @@
         </w:tc>
         <w:tc>
           <w:tcPr>
-            <w:tcW w:w="1379" w:type="dxa"/>
+            <w:tcW w:w="1380" w:type="dxa"/>
             <w:tcBorders/>
             <w:tcMar>
               <w:top w:w="57" w:type="dxa"/>
@@ -11501,15 +11456,15 @@
       <w:lang w:val="pt-BR" w:eastAsia="pt-BR" w:bidi="ar-SA"/>
     </w:rPr>
   </w:style>
-  <w:style w:type="paragraph" w:styleId="Cabealhoerodap" w:customStyle="1">
-    <w:name w:val="Cabeçalho e rodapé"/>
+  <w:style w:type="paragraph" w:styleId="Cabealhoerodapuser" w:customStyle="1">
+    <w:name w:val="Cabeçalho e rodapé (user)"/>
     <w:basedOn w:val="Normal"/>
     <w:qFormat/>
     <w:pPr/>
     <w:rPr/>
   </w:style>
-  <w:style w:type="paragraph" w:styleId="Cabealhoerodapuser" w:customStyle="1">
-    <w:name w:val="Cabeçalho e rodapé (user)"/>
+  <w:style w:type="paragraph" w:styleId="Cabealhoerodap" w:customStyle="1">
+    <w:name w:val="Cabeçalho e rodapé"/>
     <w:basedOn w:val="Normal"/>
     <w:qFormat/>
     <w:pPr/>
@@ -11582,8 +11537,8 @@
       <w:szCs w:val="20"/>
     </w:rPr>
   </w:style>
-  <w:style w:type="numbering" w:styleId="Semlista" w:customStyle="1">
-    <w:name w:val="Sem lista"/>
+  <w:style w:type="numbering" w:styleId="Semlistauser" w:customStyle="1">
+    <w:name w:val="Sem lista (user)"/>
     <w:uiPriority w:val="99"/>
     <w:semiHidden/>
     <w:unhideWhenUsed/>

</xml_diff>